<commit_message>
Refresh FE Word handoff with live Hostinger Google signup diagnosis.
Co-authored-by: Cursor <cursoragent@cursor.com>
</commit_message>
<xml_diff>
--- a/docs/Frontend_Hostinger_Google_SignIn_Handoff.docx
+++ b/docs/Frontend_Hostinger_Google_SignIn_Handoff.docx
@@ -10,77 +10,40 @@
         <w:rPr>
           <w:rFonts w:ascii="Calibri" w:hAnsi="Calibri"/>
           <w:b/>
-          <w:sz w:val="36"/>
+          <w:sz w:val="40"/>
         </w:rPr>
-        <w:t>Frontend Handoff — Hostinger Google Sign-In (NexusLexis)</w:t>
+        <w:t>NexusLexis Frontend — Issues + Required Fixes</w:t>
       </w:r>
     </w:p>
     <w:p>
       <w:pPr>
-        <w:spacing w:after="40"/>
+        <w:spacing w:after="120"/>
       </w:pPr>
-      <w:r>
-        <w:rPr>
-          <w:rFonts w:ascii="Calibri" w:hAnsi="Calibri"/>
-          <w:b/>
-          <w:sz w:val="22"/>
-        </w:rPr>
-        <w:t xml:space="preserve">Date: </w:t>
-      </w:r>
       <w:r>
         <w:rPr>
           <w:rFonts w:ascii="Calibri" w:hAnsi="Calibri"/>
           <w:b w:val="0"/>
           <w:sz w:val="22"/>
         </w:rPr>
-        <w:t>16 Oct 2026</w:t>
+        <w:t>For: Frontend team  |  From: Backend  |  Rechecked: 20 Oct 2026</w:t>
       </w:r>
     </w:p>
     <w:p>
       <w:pPr>
-        <w:spacing w:after="40"/>
+        <w:spacing w:after="120"/>
       </w:pPr>
-      <w:r>
-        <w:rPr>
-          <w:rFonts w:ascii="Calibri" w:hAnsi="Calibri"/>
-          <w:b/>
-          <w:sz w:val="22"/>
-        </w:rPr>
-        <w:t xml:space="preserve">Site: </w:t>
-      </w:r>
       <w:r>
         <w:rPr>
           <w:rFonts w:ascii="Calibri" w:hAnsi="Calibri"/>
           <w:b w:val="0"/>
           <w:sz w:val="22"/>
         </w:rPr>
-        <w:t>https://nexuslexis.law (Hostinger)</w:t>
+        <w:t>Site: https://nexuslexis.law (Hostinger)   |   Auth API: https://nexus-lexis-backend-45v4.vercel.app/api/auth</w:t>
       </w:r>
     </w:p>
     <w:p>
       <w:pPr>
-        <w:spacing w:after="40"/>
-      </w:pPr>
-      <w:r>
-        <w:rPr>
-          <w:rFonts w:ascii="Calibri" w:hAnsi="Calibri"/>
-          <w:b/>
-          <w:sz w:val="22"/>
-        </w:rPr>
-        <w:t xml:space="preserve">Auth API: </w:t>
-      </w:r>
-      <w:r>
-        <w:rPr>
-          <w:rFonts w:ascii="Calibri" w:hAnsi="Calibri"/>
-          <w:b w:val="0"/>
-          <w:sz w:val="22"/>
-        </w:rPr>
-        <w:t>https://nexus-lexis-backend-45v4.vercel.app/api/auth</w:t>
-      </w:r>
-    </w:p>
-    <w:p>
-      <w:pPr>
-        <w:spacing w:after="40"/>
+        <w:spacing w:after="120"/>
       </w:pPr>
       <w:r>
         <w:rPr>
@@ -96,7 +59,7 @@
           <w:b w:val="0"/>
           <w:sz w:val="22"/>
         </w:rPr>
-        <w:t>Backend ready. FE + Hostinger uploads required.</w:t>
+        <w:t>Auth backend is working. Live Hostinger frontend is not using the required Google flow and Hostinger still 404s SPA routes. Client secrets will not fix this.</w:t>
       </w:r>
     </w:p>
     <w:p>
@@ -104,7 +67,635 @@
         <w:pStyle w:val="Heading1"/>
       </w:pPr>
       <w:r>
-        <w:t>1. Problem (what is broken today)</w:t>
+        <w:t>Urdu summary (internal)</w:t>
+      </w:r>
+    </w:p>
+    <w:p>
+      <w:pPr>
+        <w:spacing w:after="120"/>
+      </w:pPr>
+      <w:r>
+        <w:rPr>
+          <w:rFonts w:ascii="Calibri" w:hAnsi="Calibri"/>
+          <w:b w:val="0"/>
+          <w:sz w:val="22"/>
+        </w:rPr>
+        <w:t>Google sign-up Hostinger par is liye nahi chal raha ke live site abhi bhi Google popup (GIS) use karti hai, aur Hostinger par /login, /signup 404 dete hain. Naye client secret se yeh fix nahi hota. FE ko do files public_html mein upload karni hain (.htaccess + google-auth.html) aur Google button ko /google/start redirect par lagana hai. Client secret sirf backend (Vercel) par hota hai — FE ko secret nahi dena.</w:t>
+      </w:r>
+    </w:p>
+    <w:p>
+      <w:pPr>
+        <w:spacing w:after="120"/>
+      </w:pPr>
+      <w:r>
+        <w:rPr>
+          <w:rFonts w:ascii="Calibri" w:hAnsi="Calibri"/>
+          <w:b w:val="0"/>
+          <w:sz w:val="22"/>
+        </w:rPr>
+        <w:t>Doosra issue: admin jab lawyer reject kare to FE ko Pending nahi Rejected dikhana hai, aur dubara apply enable karna hai (canReapply / canApplyAsLawyer).</w:t>
+      </w:r>
+    </w:p>
+    <w:p>
+      <w:pPr>
+        <w:pStyle w:val="Heading1"/>
+      </w:pPr>
+      <w:r>
+        <w:t>1. Live check (20 Oct 2026) — what is broken</w:t>
+      </w:r>
+    </w:p>
+    <w:tbl>
+      <w:tblPr>
+        <w:tblStyle w:val="TableGrid"/>
+        <w:tblW w:type="auto" w:w="0"/>
+        <w:tblLook w:firstColumn="1" w:firstRow="1" w:lastColumn="0" w:lastRow="0" w:noHBand="0" w:noVBand="1" w:val="04A0"/>
+      </w:tblPr>
+      <w:tblGrid>
+        <w:gridCol w:w="3264"/>
+        <w:gridCol w:w="3264"/>
+        <w:gridCol w:w="3264"/>
+      </w:tblGrid>
+      <w:tr>
+        <w:tc>
+          <w:tcPr>
+            <w:tcW w:type="dxa" w:w="3264"/>
+          </w:tcPr>
+          <w:p>
+            <w:r/>
+            <w:r>
+              <w:rPr>
+                <w:rFonts w:ascii="Calibri" w:hAnsi="Calibri"/>
+                <w:b/>
+                <w:sz w:val="20"/>
+              </w:rPr>
+              <w:t>Check</w:t>
+            </w:r>
+          </w:p>
+        </w:tc>
+        <w:tc>
+          <w:tcPr>
+            <w:tcW w:type="dxa" w:w="3264"/>
+          </w:tcPr>
+          <w:p>
+            <w:r/>
+            <w:r>
+              <w:rPr>
+                <w:rFonts w:ascii="Calibri" w:hAnsi="Calibri"/>
+                <w:b/>
+                <w:sz w:val="20"/>
+              </w:rPr>
+              <w:t>Result</w:t>
+            </w:r>
+          </w:p>
+        </w:tc>
+        <w:tc>
+          <w:tcPr>
+            <w:tcW w:type="dxa" w:w="3264"/>
+          </w:tcPr>
+          <w:p>
+            <w:r/>
+            <w:r>
+              <w:rPr>
+                <w:rFonts w:ascii="Calibri" w:hAnsi="Calibri"/>
+                <w:b/>
+                <w:sz w:val="20"/>
+              </w:rPr>
+              <w:t>Meaning</w:t>
+            </w:r>
+          </w:p>
+        </w:tc>
+      </w:tr>
+      <w:tr>
+        <w:tc>
+          <w:tcPr>
+            <w:tcW w:type="dxa" w:w="3264"/>
+          </w:tcPr>
+          <w:p>
+            <w:r/>
+            <w:r>
+              <w:rPr>
+                <w:rFonts w:ascii="Calibri" w:hAnsi="Calibri"/>
+                <w:b w:val="0"/>
+                <w:sz w:val="20"/>
+              </w:rPr>
+              <w:t>Auth /ping + /health</w:t>
+            </w:r>
+          </w:p>
+        </w:tc>
+        <w:tc>
+          <w:tcPr>
+            <w:tcW w:type="dxa" w:w="3264"/>
+          </w:tcPr>
+          <w:p>
+            <w:r/>
+            <w:r>
+              <w:rPr>
+                <w:rFonts w:ascii="Calibri" w:hAnsi="Calibri"/>
+                <w:b w:val="0"/>
+                <w:sz w:val="20"/>
+              </w:rPr>
+              <w:t>200, db ok</w:t>
+            </w:r>
+          </w:p>
+        </w:tc>
+        <w:tc>
+          <w:tcPr>
+            <w:tcW w:type="dxa" w:w="3264"/>
+          </w:tcPr>
+          <w:p>
+            <w:r/>
+            <w:r>
+              <w:rPr>
+                <w:rFonts w:ascii="Calibri" w:hAnsi="Calibri"/>
+                <w:b w:val="0"/>
+                <w:sz w:val="20"/>
+              </w:rPr>
+              <w:t>Backend is up</w:t>
+            </w:r>
+          </w:p>
+        </w:tc>
+      </w:tr>
+      <w:tr>
+        <w:tc>
+          <w:tcPr>
+            <w:tcW w:type="dxa" w:w="3264"/>
+          </w:tcPr>
+          <w:p>
+            <w:r/>
+            <w:r>
+              <w:rPr>
+                <w:rFonts w:ascii="Calibri" w:hAnsi="Calibri"/>
+                <w:b w:val="0"/>
+                <w:sz w:val="20"/>
+              </w:rPr>
+              <w:t>Auth GET /google/start</w:t>
+            </w:r>
+          </w:p>
+        </w:tc>
+        <w:tc>
+          <w:tcPr>
+            <w:tcW w:type="dxa" w:w="3264"/>
+          </w:tcPr>
+          <w:p>
+            <w:r/>
+            <w:r>
+              <w:rPr>
+                <w:rFonts w:ascii="Calibri" w:hAnsi="Calibri"/>
+                <w:b w:val="0"/>
+                <w:sz w:val="20"/>
+              </w:rPr>
+              <w:t>302 to Google</w:t>
+            </w:r>
+          </w:p>
+        </w:tc>
+        <w:tc>
+          <w:tcPr>
+            <w:tcW w:type="dxa" w:w="3264"/>
+          </w:tcPr>
+          <w:p>
+            <w:r/>
+            <w:r>
+              <w:rPr>
+                <w:rFonts w:ascii="Calibri" w:hAnsi="Calibri"/>
+                <w:b w:val="0"/>
+                <w:sz w:val="20"/>
+              </w:rPr>
+              <w:t>Redirect flow on backend works</w:t>
+            </w:r>
+          </w:p>
+        </w:tc>
+      </w:tr>
+      <w:tr>
+        <w:tc>
+          <w:tcPr>
+            <w:tcW w:type="dxa" w:w="3264"/>
+          </w:tcPr>
+          <w:p>
+            <w:r/>
+            <w:r>
+              <w:rPr>
+                <w:rFonts w:ascii="Calibri" w:hAnsi="Calibri"/>
+                <w:b w:val="0"/>
+                <w:sz w:val="20"/>
+              </w:rPr>
+              <w:t>https://nexuslexis.law/</w:t>
+            </w:r>
+          </w:p>
+        </w:tc>
+        <w:tc>
+          <w:tcPr>
+            <w:tcW w:type="dxa" w:w="3264"/>
+          </w:tcPr>
+          <w:p>
+            <w:r/>
+            <w:r>
+              <w:rPr>
+                <w:rFonts w:ascii="Calibri" w:hAnsi="Calibri"/>
+                <w:b w:val="0"/>
+                <w:sz w:val="20"/>
+              </w:rPr>
+              <w:t>200</w:t>
+            </w:r>
+          </w:p>
+        </w:tc>
+        <w:tc>
+          <w:tcPr>
+            <w:tcW w:type="dxa" w:w="3264"/>
+          </w:tcPr>
+          <w:p>
+            <w:r/>
+            <w:r>
+              <w:rPr>
+                <w:rFonts w:ascii="Calibri" w:hAnsi="Calibri"/>
+                <w:b w:val="0"/>
+                <w:sz w:val="20"/>
+              </w:rPr>
+              <w:t>Home works</w:t>
+            </w:r>
+          </w:p>
+        </w:tc>
+      </w:tr>
+      <w:tr>
+        <w:tc>
+          <w:tcPr>
+            <w:tcW w:type="dxa" w:w="3264"/>
+          </w:tcPr>
+          <w:p>
+            <w:r/>
+            <w:r>
+              <w:rPr>
+                <w:rFonts w:ascii="Calibri" w:hAnsi="Calibri"/>
+                <w:b w:val="0"/>
+                <w:sz w:val="20"/>
+              </w:rPr>
+              <w:t>https://nexuslexis.law/login</w:t>
+            </w:r>
+          </w:p>
+        </w:tc>
+        <w:tc>
+          <w:tcPr>
+            <w:tcW w:type="dxa" w:w="3264"/>
+          </w:tcPr>
+          <w:p>
+            <w:r/>
+            <w:r>
+              <w:rPr>
+                <w:rFonts w:ascii="Calibri" w:hAnsi="Calibri"/>
+                <w:b w:val="0"/>
+                <w:sz w:val="20"/>
+              </w:rPr>
+              <w:t>404</w:t>
+            </w:r>
+          </w:p>
+        </w:tc>
+        <w:tc>
+          <w:tcPr>
+            <w:tcW w:type="dxa" w:w="3264"/>
+          </w:tcPr>
+          <w:p>
+            <w:r/>
+            <w:r>
+              <w:rPr>
+                <w:rFonts w:ascii="Calibri" w:hAnsi="Calibri"/>
+                <w:b w:val="0"/>
+                <w:sz w:val="20"/>
+              </w:rPr>
+              <w:t>No SPA rewrite on Hostinger</w:t>
+            </w:r>
+          </w:p>
+        </w:tc>
+      </w:tr>
+      <w:tr>
+        <w:tc>
+          <w:tcPr>
+            <w:tcW w:type="dxa" w:w="3264"/>
+          </w:tcPr>
+          <w:p>
+            <w:r/>
+            <w:r>
+              <w:rPr>
+                <w:rFonts w:ascii="Calibri" w:hAnsi="Calibri"/>
+                <w:b w:val="0"/>
+                <w:sz w:val="20"/>
+              </w:rPr>
+              <w:t>https://nexuslexis.law/signup</w:t>
+            </w:r>
+          </w:p>
+        </w:tc>
+        <w:tc>
+          <w:tcPr>
+            <w:tcW w:type="dxa" w:w="3264"/>
+          </w:tcPr>
+          <w:p>
+            <w:r/>
+            <w:r>
+              <w:rPr>
+                <w:rFonts w:ascii="Calibri" w:hAnsi="Calibri"/>
+                <w:b w:val="0"/>
+                <w:sz w:val="20"/>
+              </w:rPr>
+              <w:t>404</w:t>
+            </w:r>
+          </w:p>
+        </w:tc>
+        <w:tc>
+          <w:tcPr>
+            <w:tcW w:type="dxa" w:w="3264"/>
+          </w:tcPr>
+          <w:p>
+            <w:r/>
+            <w:r>
+              <w:rPr>
+                <w:rFonts w:ascii="Calibri" w:hAnsi="Calibri"/>
+                <w:b w:val="0"/>
+                <w:sz w:val="20"/>
+              </w:rPr>
+              <w:t>No SPA rewrite — signup URL itself is broken</w:t>
+            </w:r>
+          </w:p>
+        </w:tc>
+      </w:tr>
+      <w:tr>
+        <w:tc>
+          <w:tcPr>
+            <w:tcW w:type="dxa" w:w="3264"/>
+          </w:tcPr>
+          <w:p>
+            <w:r/>
+            <w:r>
+              <w:rPr>
+                <w:rFonts w:ascii="Calibri" w:hAnsi="Calibri"/>
+                <w:b w:val="0"/>
+                <w:sz w:val="20"/>
+              </w:rPr>
+              <w:t>https://nexuslexis.law/google-auth.html</w:t>
+            </w:r>
+          </w:p>
+        </w:tc>
+        <w:tc>
+          <w:tcPr>
+            <w:tcW w:type="dxa" w:w="3264"/>
+          </w:tcPr>
+          <w:p>
+            <w:r/>
+            <w:r>
+              <w:rPr>
+                <w:rFonts w:ascii="Calibri" w:hAnsi="Calibri"/>
+                <w:b w:val="0"/>
+                <w:sz w:val="20"/>
+              </w:rPr>
+              <w:t>404</w:t>
+            </w:r>
+          </w:p>
+        </w:tc>
+        <w:tc>
+          <w:tcPr>
+            <w:tcW w:type="dxa" w:w="3264"/>
+          </w:tcPr>
+          <w:p>
+            <w:r/>
+            <w:r>
+              <w:rPr>
+                <w:rFonts w:ascii="Calibri" w:hAnsi="Calibri"/>
+                <w:b w:val="0"/>
+                <w:sz w:val="20"/>
+              </w:rPr>
+              <w:t>Google return page not uploaded</w:t>
+            </w:r>
+          </w:p>
+        </w:tc>
+      </w:tr>
+      <w:tr>
+        <w:tc>
+          <w:tcPr>
+            <w:tcW w:type="dxa" w:w="3264"/>
+          </w:tcPr>
+          <w:p>
+            <w:r/>
+            <w:r>
+              <w:rPr>
+                <w:rFonts w:ascii="Calibri" w:hAnsi="Calibri"/>
+                <w:b w:val="0"/>
+                <w:sz w:val="20"/>
+              </w:rPr>
+              <w:t>https://nexuslexis.netlify.app/login</w:t>
+            </w:r>
+          </w:p>
+        </w:tc>
+        <w:tc>
+          <w:tcPr>
+            <w:tcW w:type="dxa" w:w="3264"/>
+          </w:tcPr>
+          <w:p>
+            <w:r/>
+            <w:r>
+              <w:rPr>
+                <w:rFonts w:ascii="Calibri" w:hAnsi="Calibri"/>
+                <w:b w:val="0"/>
+                <w:sz w:val="20"/>
+              </w:rPr>
+              <w:t>200</w:t>
+            </w:r>
+          </w:p>
+        </w:tc>
+        <w:tc>
+          <w:tcPr>
+            <w:tcW w:type="dxa" w:w="3264"/>
+          </w:tcPr>
+          <w:p>
+            <w:r/>
+            <w:r>
+              <w:rPr>
+                <w:rFonts w:ascii="Calibri" w:hAnsi="Calibri"/>
+                <w:b w:val="0"/>
+                <w:sz w:val="20"/>
+              </w:rPr>
+              <w:t>Netlify SPA rewrite is fine; Hostinger is not</w:t>
+            </w:r>
+          </w:p>
+        </w:tc>
+      </w:tr>
+      <w:tr>
+        <w:tc>
+          <w:tcPr>
+            <w:tcW w:type="dxa" w:w="3264"/>
+          </w:tcPr>
+          <w:p>
+            <w:r/>
+            <w:r>
+              <w:rPr>
+                <w:rFonts w:ascii="Calibri" w:hAnsi="Calibri"/>
+                <w:b w:val="0"/>
+                <w:sz w:val="20"/>
+              </w:rPr>
+              <w:t>Live JS bundle index-BAz4ttsT.js</w:t>
+            </w:r>
+          </w:p>
+        </w:tc>
+        <w:tc>
+          <w:tcPr>
+            <w:tcW w:type="dxa" w:w="3264"/>
+          </w:tcPr>
+          <w:p>
+            <w:r/>
+            <w:r>
+              <w:rPr>
+                <w:rFonts w:ascii="Calibri" w:hAnsi="Calibri"/>
+                <w:b w:val="0"/>
+                <w:sz w:val="20"/>
+              </w:rPr>
+              <w:t>GoogleOAuthProvider + POST /google/token</w:t>
+            </w:r>
+          </w:p>
+        </w:tc>
+        <w:tc>
+          <w:tcPr>
+            <w:tcW w:type="dxa" w:w="3264"/>
+          </w:tcPr>
+          <w:p>
+            <w:r/>
+            <w:r>
+              <w:rPr>
+                <w:rFonts w:ascii="Calibri" w:hAnsi="Calibri"/>
+                <w:b w:val="0"/>
+                <w:sz w:val="20"/>
+              </w:rPr>
+              <w:t>Old GIS popup still live. No /google/start in the build</w:t>
+            </w:r>
+          </w:p>
+        </w:tc>
+      </w:tr>
+    </w:tbl>
+    <w:p/>
+    <w:p>
+      <w:pPr>
+        <w:spacing w:after="120"/>
+      </w:pPr>
+      <w:r>
+        <w:rPr>
+          <w:rFonts w:ascii="Calibri" w:hAnsi="Calibri"/>
+          <w:b/>
+          <w:sz w:val="22"/>
+        </w:rPr>
+        <w:t xml:space="preserve">Bottom line: </w:t>
+      </w:r>
+      <w:r>
+        <w:rPr>
+          <w:rFonts w:ascii="Calibri" w:hAnsi="Calibri"/>
+          <w:b w:val="0"/>
+          <w:sz w:val="22"/>
+        </w:rPr>
+        <w:t>Changing Google Client ID/secret on FE does not fix Hostinger. The live Hostinger deploy is still the old popup + token API, and Apache is not serving React routes.</w:t>
+      </w:r>
+    </w:p>
+    <w:p>
+      <w:pPr>
+        <w:pStyle w:val="Heading1"/>
+      </w:pPr>
+      <w:r>
+        <w:t>2. Issue A — Google Sign-Up stuck on Hostinger</w:t>
+      </w:r>
+    </w:p>
+    <w:p>
+      <w:pPr>
+        <w:pStyle w:val="Heading2"/>
+      </w:pPr>
+      <w:r>
+        <w:t>Why it fails</w:t>
+      </w:r>
+    </w:p>
+    <w:p>
+      <w:pPr>
+        <w:pStyle w:val="ListBullet"/>
+      </w:pPr>
+      <w:r>
+        <w:rPr>
+          <w:rFonts w:ascii="Calibri" w:hAnsi="Calibri"/>
+          <w:b w:val="0"/>
+          <w:sz w:val="22"/>
+        </w:rPr>
+        <w:t>Live Hostinger app still uses GIS popup (GoogleOAuthProvider) then POST /api/auth/google/token. On Hostinger this often becomes FETCH_ERROR (“Unable to reach the server”) or Google origin_mismatch.</w:t>
+      </w:r>
+    </w:p>
+    <w:p>
+      <w:pPr>
+        <w:pStyle w:val="ListBullet"/>
+      </w:pPr>
+      <w:r>
+        <w:rPr>
+          <w:rFonts w:ascii="Calibri" w:hAnsi="Calibri"/>
+          <w:b w:val="0"/>
+          <w:sz w:val="22"/>
+        </w:rPr>
+        <w:t>Hostinger Apache has no SPA fallback. Direct URLs /login /signup /account return Hostinger 404 HTML.</w:t>
+      </w:r>
+    </w:p>
+    <w:p>
+      <w:pPr>
+        <w:pStyle w:val="ListBullet"/>
+      </w:pPr>
+      <w:r>
+        <w:rPr>
+          <w:rFonts w:ascii="Calibri" w:hAnsi="Calibri"/>
+          <w:b w:val="0"/>
+          <w:sz w:val="22"/>
+        </w:rPr>
+        <w:t>Auth redirect now returns to /google-auth.html?token=… That file is not on Hostinger, so even the correct OAuth return lands on 404.</w:t>
+      </w:r>
+    </w:p>
+    <w:p>
+      <w:pPr>
+        <w:pStyle w:val="ListBullet"/>
+      </w:pPr>
+      <w:r>
+        <w:rPr>
+          <w:rFonts w:ascii="Calibri" w:hAnsi="Calibri"/>
+          <w:b w:val="0"/>
+          <w:sz w:val="22"/>
+        </w:rPr>
+        <w:t>Client secret is backend-only. FE must never receive or embed GOOGLE_CLIENT_SECRET. FE only uses Client ID if GIS is used (we do not want GIS on Hostinger).</w:t>
+      </w:r>
+    </w:p>
+    <w:p>
+      <w:pPr>
+        <w:pStyle w:val="Heading1"/>
+      </w:pPr>
+      <w:r>
+        <w:t>3. What FE must do (required)</w:t>
+      </w:r>
+    </w:p>
+    <w:p>
+      <w:pPr>
+        <w:spacing w:after="120"/>
+      </w:pPr>
+      <w:r>
+        <w:rPr>
+          <w:rFonts w:ascii="Calibri" w:hAnsi="Calibri"/>
+          <w:b/>
+          <w:sz w:val="22"/>
+        </w:rPr>
+        <w:t>Do all three. Secrets alone are not enough.</w:t>
+      </w:r>
+    </w:p>
+    <w:p>
+      <w:pPr>
+        <w:pStyle w:val="Heading2"/>
+      </w:pPr>
+      <w:r>
+        <w:t>Step 1 — Upload two files to Hostinger public_html</w:t>
+      </w:r>
+    </w:p>
+    <w:p>
+      <w:pPr>
+        <w:spacing w:after="120"/>
+      </w:pPr>
+      <w:r>
+        <w:rPr>
+          <w:rFonts w:ascii="Calibri" w:hAnsi="Calibri"/>
+          <w:b w:val="0"/>
+          <w:sz w:val="22"/>
+        </w:rPr>
+        <w:t>Upload next to index.html (not inside /assets).</w:t>
       </w:r>
     </w:p>
     <w:tbl>
@@ -130,7 +721,7 @@
                 <w:b/>
                 <w:sz w:val="20"/>
               </w:rPr>
-              <w:t>Issue</w:t>
+              <w:t>File to upload</w:t>
             </w:r>
           </w:p>
         </w:tc>
@@ -146,228 +737,7 @@
                 <w:b/>
                 <w:sz w:val="20"/>
               </w:rPr>
-              <w:t>Evidence</w:t>
-            </w:r>
-          </w:p>
-        </w:tc>
-      </w:tr>
-      <w:tr>
-        <w:tc>
-          <w:tcPr>
-            <w:tcW w:type="dxa" w:w="4896"/>
-          </w:tcPr>
-          <w:p>
-            <w:r/>
-            <w:r>
-              <w:rPr>
-                <w:rFonts w:ascii="Calibri" w:hAnsi="Calibri"/>
-                <w:b w:val="0"/>
-                <w:sz w:val="20"/>
-              </w:rPr>
-              <w:t>Google signup stuck on Hostinger</w:t>
-            </w:r>
-          </w:p>
-        </w:tc>
-        <w:tc>
-          <w:tcPr>
-            <w:tcW w:type="dxa" w:w="4896"/>
-          </w:tcPr>
-          <w:p>
-            <w:r/>
-            <w:r>
-              <w:rPr>
-                <w:rFonts w:ascii="Calibri" w:hAnsi="Calibri"/>
-                <w:b w:val="0"/>
-                <w:sz w:val="20"/>
-              </w:rPr>
-              <w:t>Live bundle still uses GoogleOAuthProvider → POST /google/token</w:t>
-            </w:r>
-          </w:p>
-        </w:tc>
-      </w:tr>
-      <w:tr>
-        <w:tc>
-          <w:tcPr>
-            <w:tcW w:type="dxa" w:w="4896"/>
-          </w:tcPr>
-          <w:p>
-            <w:r/>
-            <w:r>
-              <w:rPr>
-                <w:rFonts w:ascii="Calibri" w:hAnsi="Calibri"/>
-                <w:b w:val="0"/>
-                <w:sz w:val="20"/>
-              </w:rPr>
-              <w:t>SPA routes 404</w:t>
-            </w:r>
-          </w:p>
-        </w:tc>
-        <w:tc>
-          <w:tcPr>
-            <w:tcW w:type="dxa" w:w="4896"/>
-          </w:tcPr>
-          <w:p>
-            <w:r/>
-            <w:r>
-              <w:rPr>
-                <w:rFonts w:ascii="Calibri" w:hAnsi="Calibri"/>
-                <w:b w:val="0"/>
-                <w:sz w:val="20"/>
-              </w:rPr>
-              <w:t>/login, /signup, /account, etc. return 404; only / works</w:t>
-            </w:r>
-          </w:p>
-        </w:tc>
-      </w:tr>
-      <w:tr>
-        <w:tc>
-          <w:tcPr>
-            <w:tcW w:type="dxa" w:w="4896"/>
-          </w:tcPr>
-          <w:p>
-            <w:r/>
-            <w:r>
-              <w:rPr>
-                <w:rFonts w:ascii="Calibri" w:hAnsi="Calibri"/>
-                <w:b w:val="0"/>
-                <w:sz w:val="20"/>
-              </w:rPr>
-              <w:t>Google return URL broken</w:t>
-            </w:r>
-          </w:p>
-        </w:tc>
-        <w:tc>
-          <w:tcPr>
-            <w:tcW w:type="dxa" w:w="4896"/>
-          </w:tcPr>
-          <w:p>
-            <w:r/>
-            <w:r>
-              <w:rPr>
-                <w:rFonts w:ascii="Calibri" w:hAnsi="Calibri"/>
-                <w:b w:val="0"/>
-                <w:sz w:val="20"/>
-              </w:rPr>
-              <w:t>Auth used to send users to /login?token=… → Hostinger 404</w:t>
-            </w:r>
-          </w:p>
-        </w:tc>
-      </w:tr>
-      <w:tr>
-        <w:tc>
-          <w:tcPr>
-            <w:tcW w:type="dxa" w:w="4896"/>
-          </w:tcPr>
-          <w:p>
-            <w:r/>
-            <w:r>
-              <w:rPr>
-                <w:rFonts w:ascii="Calibri" w:hAnsi="Calibri"/>
-                <w:b w:val="0"/>
-                <w:sz w:val="20"/>
-              </w:rPr>
-              <w:t>Netlify OK, Hostinger not</w:t>
-            </w:r>
-          </w:p>
-        </w:tc>
-        <w:tc>
-          <w:tcPr>
-            <w:tcW w:type="dxa" w:w="4896"/>
-          </w:tcPr>
-          <w:p>
-            <w:r/>
-            <w:r>
-              <w:rPr>
-                <w:rFonts w:ascii="Calibri" w:hAnsi="Calibri"/>
-                <w:b w:val="0"/>
-                <w:sz w:val="20"/>
-              </w:rPr>
-              <w:t>nexuslexis.netlify.app/login works (SPA rewrite); Hostinger has none</w:t>
-            </w:r>
-          </w:p>
-        </w:tc>
-      </w:tr>
-    </w:tbl>
-    <w:p/>
-    <w:p>
-      <w:r>
-        <w:rPr>
-          <w:rFonts w:ascii="Calibri" w:hAnsi="Calibri"/>
-          <w:b/>
-          <w:sz w:val="22"/>
-        </w:rPr>
-        <w:t xml:space="preserve">Do not keep GIS popup on Hostinger. </w:t>
-      </w:r>
-      <w:r>
-        <w:rPr>
-          <w:rFonts w:ascii="Calibri" w:hAnsi="Calibri"/>
-          <w:b w:val="0"/>
-          <w:sz w:val="22"/>
-        </w:rPr>
-        <w:t>It causes FETCH_ERROR / origin_mismatch. Use full-page redirect.</w:t>
-      </w:r>
-    </w:p>
-    <w:p>
-      <w:pPr>
-        <w:pStyle w:val="Heading1"/>
-      </w:pPr>
-      <w:r>
-        <w:t>2. Required Hostinger uploads (do first)</w:t>
-      </w:r>
-    </w:p>
-    <w:p>
-      <w:pPr>
-        <w:spacing w:after="120"/>
-      </w:pPr>
-      <w:r>
-        <w:rPr>
-          <w:rFonts w:ascii="Calibri" w:hAnsi="Calibri"/>
-          <w:b w:val="0"/>
-          <w:sz w:val="22"/>
-        </w:rPr>
-        <w:t>Upload these two files into public_html (same folder as index.html):</w:t>
-      </w:r>
-    </w:p>
-    <w:tbl>
-      <w:tblPr>
-        <w:tblStyle w:val="TableGrid"/>
-        <w:tblW w:type="auto" w:w="0"/>
-        <w:tblLook w:firstColumn="1" w:firstRow="1" w:lastColumn="0" w:lastRow="0" w:noHBand="0" w:noVBand="1" w:val="04A0"/>
-      </w:tblPr>
-      <w:tblGrid>
-        <w:gridCol w:w="4896"/>
-        <w:gridCol w:w="4896"/>
-      </w:tblGrid>
-      <w:tr>
-        <w:tc>
-          <w:tcPr>
-            <w:tcW w:type="dxa" w:w="4896"/>
-          </w:tcPr>
-          <w:p>
-            <w:r/>
-            <w:r>
-              <w:rPr>
-                <w:rFonts w:ascii="Calibri" w:hAnsi="Calibri"/>
-                <w:b/>
-                <w:sz w:val="20"/>
-              </w:rPr>
-              <w:t>Source in backend repo</w:t>
-            </w:r>
-          </w:p>
-        </w:tc>
-        <w:tc>
-          <w:tcPr>
-            <w:tcW w:type="dxa" w:w="4896"/>
-          </w:tcPr>
-          <w:p>
-            <w:r/>
-            <w:r>
-              <w:rPr>
-                <w:rFonts w:ascii="Calibri" w:hAnsi="Calibri"/>
-                <w:b/>
-                <w:sz w:val="20"/>
-              </w:rPr>
-              <w:t>Upload as</w:t>
+              <w:t>Put on Hostinger as</w:t>
             </w:r>
           </w:p>
         </w:tc>
@@ -483,10 +853,15 @@
     </w:p>
     <w:p>
       <w:pPr>
-        <w:pStyle w:val="Heading2"/>
+        <w:spacing w:after="120"/>
       </w:pPr>
       <w:r>
-        <w:t>What each file does</w:t>
+        <w:rPr>
+          <w:rFonts w:ascii="Calibri" w:hAnsi="Calibri"/>
+          <w:b w:val="0"/>
+          <w:sz w:val="22"/>
+        </w:rPr>
+        <w:t>What they do:</w:t>
       </w:r>
     </w:p>
     <w:p>
@@ -507,7 +882,7 @@
           <w:b w:val="0"/>
           <w:sz w:val="22"/>
         </w:rPr>
-        <w:t xml:space="preserve"> — Apache SPA fallback so /login, /signup, /account serve index.html (no more 404).</w:t>
+        <w:t xml:space="preserve"> — Apache rewrite so /login /signup /account serve index.html instead of 404.</w:t>
       </w:r>
     </w:p>
     <w:p>
@@ -528,15 +903,20 @@
           <w:b w:val="0"/>
           <w:sz w:val="22"/>
         </w:rPr>
-        <w:t xml:space="preserve"> — After Google OAuth, Auth redirects here with ?token=&amp;refreshToken=. Writes sessionStorage keys (accessToken, token, refreshToken), then sends user to /.</w:t>
+        <w:t xml:space="preserve"> — After Google, Auth redirects here with tokens. Page writes sessionStorage then goes to /.</w:t>
       </w:r>
     </w:p>
     <w:p>
       <w:pPr>
-        <w:pStyle w:val="Heading2"/>
+        <w:spacing w:after="120"/>
       </w:pPr>
       <w:r>
-        <w:t>Verify uploads</w:t>
+        <w:rPr>
+          <w:rFonts w:ascii="Calibri" w:hAnsi="Calibri"/>
+          <w:b w:val="0"/>
+          <w:sz w:val="22"/>
+        </w:rPr>
+        <w:t>Verify after upload (hard refresh):</w:t>
       </w:r>
     </w:p>
     <w:p>
@@ -550,7 +930,7 @@
           <w:b w:val="0"/>
           <w:sz w:val="18"/>
         </w:rPr>
-        <w:t>https://nexuslexis.law/login              → 200 (app shell, not Hostinger 404)</w:t>
+        <w:t>https://nexuslexis.law/login              → 200 (app shell, NOT Hostinger 404 page)</w:t>
         <w:br/>
       </w:r>
       <w:r>
@@ -574,23 +954,15 @@
     </w:p>
     <w:p>
       <w:pPr>
-        <w:pStyle w:val="Heading1"/>
+        <w:pStyle w:val="Heading2"/>
       </w:pPr>
       <w:r>
-        <w:t>3. Required code change — Google button</w:t>
+        <w:t>Step 2 — Change the Google button (redeploy this build to Hostinger)</w:t>
       </w:r>
     </w:p>
     <w:p>
       <w:pPr>
-        <w:pStyle w:val="Heading2"/>
-      </w:pPr>
-      <w:r>
-        <w:t>Remove (production Hostinger)</w:t>
-      </w:r>
-    </w:p>
-    <w:p>
-      <w:pPr>
-        <w:pStyle w:val="ListBullet"/>
+        <w:spacing w:after="120"/>
       </w:pPr>
       <w:r>
         <w:rPr>
@@ -598,12 +970,12 @@
           <w:b w:val="0"/>
           <w:sz w:val="22"/>
         </w:rPr>
-        <w:t>@react-oauth/google / GoogleOAuthProvider / GIS popup button for Hostinger production</w:t>
+        <w:t>Remove GIS popup on Hostinger production: GoogleOAuthProvider / @react-oauth/google as the primary path. Do not POST /google/token as the main Hostinger flow.</w:t>
       </w:r>
     </w:p>
     <w:p>
       <w:pPr>
-        <w:pStyle w:val="ListBullet"/>
+        <w:spacing w:after="120"/>
       </w:pPr>
       <w:r>
         <w:rPr>
@@ -611,15 +983,7 @@
           <w:b w:val="0"/>
           <w:sz w:val="22"/>
         </w:rPr>
-        <w:t>POST /google/token as the primary path</w:t>
-      </w:r>
-    </w:p>
-    <w:p>
-      <w:pPr>
-        <w:pStyle w:val="Heading2"/>
-      </w:pPr>
-      <w:r>
-        <w:t>Add — redirect start</w:t>
+        <w:t>Use full-page redirect:</w:t>
       </w:r>
     </w:p>
     <w:p>
@@ -668,42 +1032,6 @@
           <w:b w:val="0"/>
           <w:sz w:val="18"/>
         </w:rPr>
-        <w:t>/**</w:t>
-        <w:br/>
-      </w:r>
-      <w:r>
-        <w:rPr>
-          <w:rFonts w:ascii="Consolas" w:hAnsi="Consolas"/>
-          <w:b w:val="0"/>
-          <w:sz w:val="18"/>
-        </w:rPr>
-        <w:t xml:space="preserve"> * Full-page Google sign-in (no popup, no CORS XHR).</w:t>
-        <w:br/>
-      </w:r>
-      <w:r>
-        <w:rPr>
-          <w:rFonts w:ascii="Consolas" w:hAnsi="Consolas"/>
-          <w:b w:val="0"/>
-          <w:sz w:val="18"/>
-        </w:rPr>
-        <w:t xml:space="preserve"> * @param {'client'|'lawyer'|'ca'} role</w:t>
-        <w:br/>
-      </w:r>
-      <w:r>
-        <w:rPr>
-          <w:rFonts w:ascii="Consolas" w:hAnsi="Consolas"/>
-          <w:b w:val="0"/>
-          <w:sz w:val="18"/>
-        </w:rPr>
-        <w:t xml:space="preserve"> */</w:t>
-        <w:br/>
-      </w:r>
-      <w:r>
-        <w:rPr>
-          <w:rFonts w:ascii="Consolas" w:hAnsi="Consolas"/>
-          <w:b w:val="0"/>
-          <w:sz w:val="18"/>
-        </w:rPr>
         <w:t>export function startGoogleSignIn(role = 'client') {</w:t>
         <w:br/>
       </w:r>
@@ -714,15 +1042,6 @@
           <w:sz w:val="18"/>
         </w:rPr>
         <w:t xml:space="preserve">  const safeRole = ['client', 'lawyer', 'ca'].includes(role) ? role : 'client';</w:t>
-        <w:br/>
-      </w:r>
-      <w:r>
-        <w:rPr>
-          <w:rFonts w:ascii="Consolas" w:hAnsi="Consolas"/>
-          <w:b w:val="0"/>
-          <w:sz w:val="18"/>
-        </w:rPr>
-        <w:t xml:space="preserve">  // Warm Auth cold start (optional)</w:t>
         <w:br/>
       </w:r>
       <w:r>
@@ -770,25 +1089,23 @@
         <w:t>}</w:t>
         <w:br/>
       </w:r>
-    </w:p>
-    <w:p>
-      <w:pPr>
-        <w:spacing w:after="120"/>
-      </w:pPr>
       <w:r>
         <w:rPr>
-          <w:rFonts w:ascii="Calibri" w:hAnsi="Calibri"/>
+          <w:rFonts w:ascii="Consolas" w:hAnsi="Consolas"/>
           <w:b w:val="0"/>
-          <w:sz w:val="22"/>
+          <w:sz w:val="18"/>
         </w:rPr>
-        <w:t>Wire Login / SignUp Google buttons:</w:t>
+        <w:br/>
       </w:r>
-    </w:p>
-    <w:p>
-      <w:pPr>
-        <w:spacing w:before="80" w:after="160"/>
-        <w:shd w:fill="F5F5F5" w:val="clear"/>
-      </w:pPr>
+      <w:r>
+        <w:rPr>
+          <w:rFonts w:ascii="Consolas" w:hAnsi="Consolas"/>
+          <w:b w:val="0"/>
+          <w:sz w:val="18"/>
+        </w:rPr>
+        <w:t>// Login + SignUp buttons:</w:t>
+        <w:br/>
+      </w:r>
       <w:r>
         <w:rPr>
           <w:rFonts w:ascii="Consolas" w:hAnsi="Consolas"/>
@@ -827,15 +1144,20 @@
           <w:b w:val="0"/>
           <w:sz w:val="22"/>
         </w:rPr>
-        <w:t>On SignUp, pass the selected role (client | lawyer | ca).</w:t>
+        <w:t>On SignUp, pass selected role: client | lawyer | ca.</w:t>
       </w:r>
     </w:p>
     <w:p>
       <w:pPr>
-        <w:pStyle w:val="Heading2"/>
+        <w:spacing w:after="120"/>
       </w:pPr>
       <w:r>
-        <w:t>Optional: warm Auth on app boot</w:t>
+        <w:rPr>
+          <w:rFonts w:ascii="Calibri" w:hAnsi="Calibri"/>
+          <w:b w:val="0"/>
+          <w:sz w:val="22"/>
+        </w:rPr>
+        <w:t>Optional warm-up on app boot:</w:t>
       </w:r>
     </w:p>
     <w:p>
@@ -873,111 +1195,10 @@
     </w:p>
     <w:p>
       <w:pPr>
-        <w:pStyle w:val="Heading1"/>
-      </w:pPr>
-      <w:r>
-        <w:t>4. End-to-end flow (after FE change)</w:t>
-      </w:r>
-    </w:p>
-    <w:p>
-      <w:pPr>
-        <w:spacing w:before="80" w:after="160"/>
-        <w:shd w:fill="F5F5F5" w:val="clear"/>
-      </w:pPr>
-      <w:r>
-        <w:rPr>
-          <w:rFonts w:ascii="Consolas" w:hAnsi="Consolas"/>
-          <w:b w:val="0"/>
-          <w:sz w:val="18"/>
-        </w:rPr>
-        <w:t>User clicks “Continue with Google”</w:t>
-        <w:br/>
-      </w:r>
-      <w:r>
-        <w:rPr>
-          <w:rFonts w:ascii="Consolas" w:hAnsi="Consolas"/>
-          <w:b w:val="0"/>
-          <w:sz w:val="18"/>
-        </w:rPr>
-        <w:t xml:space="preserve">  → GET {AUTH}/google/start?role=…&amp;returnTo=https://nexuslexis.law</w:t>
-        <w:br/>
-      </w:r>
-      <w:r>
-        <w:rPr>
-          <w:rFonts w:ascii="Consolas" w:hAnsi="Consolas"/>
-          <w:b w:val="0"/>
-          <w:sz w:val="18"/>
-        </w:rPr>
-        <w:t xml:space="preserve">  → Google consent screen</w:t>
-        <w:br/>
-      </w:r>
-      <w:r>
-        <w:rPr>
-          <w:rFonts w:ascii="Consolas" w:hAnsi="Consolas"/>
-          <w:b w:val="0"/>
-          <w:sz w:val="18"/>
-        </w:rPr>
-        <w:t xml:space="preserve">  → GET {AUTH}/google/callback?code=…</w:t>
-        <w:br/>
-      </w:r>
-      <w:r>
-        <w:rPr>
-          <w:rFonts w:ascii="Consolas" w:hAnsi="Consolas"/>
-          <w:b w:val="0"/>
-          <w:sz w:val="18"/>
-        </w:rPr>
-        <w:t xml:space="preserve">  → 302 → https://nexuslexis.law/google-auth.html?token=…&amp;refreshToken=…</w:t>
-        <w:br/>
-      </w:r>
-      <w:r>
-        <w:rPr>
-          <w:rFonts w:ascii="Consolas" w:hAnsi="Consolas"/>
-          <w:b w:val="0"/>
-          <w:sz w:val="18"/>
-        </w:rPr>
-        <w:t xml:space="preserve">  → google-auth.html writes sessionStorage</w:t>
-        <w:br/>
-      </w:r>
-      <w:r>
-        <w:rPr>
-          <w:rFonts w:ascii="Consolas" w:hAnsi="Consolas"/>
-          <w:b w:val="0"/>
-          <w:sz w:val="18"/>
-        </w:rPr>
-        <w:t xml:space="preserve">  → redirect → /</w:t>
-        <w:br/>
-      </w:r>
-      <w:r>
-        <w:rPr>
-          <w:rFonts w:ascii="Consolas" w:hAnsi="Consolas"/>
-          <w:b w:val="0"/>
-          <w:sz w:val="18"/>
-        </w:rPr>
-        <w:t xml:space="preserve">  → React app sees accessToken → treat as logged in → GET /me for user</w:t>
-        <w:br/>
-      </w:r>
-    </w:p>
-    <w:p>
-      <w:pPr>
         <w:pStyle w:val="Heading2"/>
       </w:pPr>
       <w:r>
-        <w:t>Error return</w:t>
-      </w:r>
-    </w:p>
-    <w:p>
-      <w:pPr>
-        <w:spacing w:before="80" w:after="160"/>
-        <w:shd w:fill="F5F5F5" w:val="clear"/>
-      </w:pPr>
-      <w:r>
-        <w:rPr>
-          <w:rFonts w:ascii="Consolas" w:hAnsi="Consolas"/>
-          <w:b w:val="0"/>
-          <w:sz w:val="18"/>
-        </w:rPr>
-        <w:t>/google-auth.html?googleError=&lt;message&gt;&amp;next=/login</w:t>
-        <w:br/>
+        <w:t>Step 3 — After redirect, hydrate the session</w:t>
       </w:r>
     </w:p>
     <w:p>
@@ -990,28 +1211,7 @@
           <w:b w:val="0"/>
           <w:sz w:val="22"/>
         </w:rPr>
-        <w:t>Show the message or send user to /login.</w:t>
-      </w:r>
-    </w:p>
-    <w:p>
-      <w:pPr>
-        <w:pStyle w:val="Heading1"/>
-      </w:pPr>
-      <w:r>
-        <w:t>5. sessionStorage contract (already used by live FE)</w:t>
-      </w:r>
-    </w:p>
-    <w:p>
-      <w:pPr>
-        <w:spacing w:after="120"/>
-      </w:pPr>
-      <w:r>
-        <w:rPr>
-          <w:rFonts w:ascii="Calibri" w:hAnsi="Calibri"/>
-          <w:b w:val="0"/>
-          <w:sz w:val="22"/>
-        </w:rPr>
-        <w:t>google-auth.html writes the same keys as current tokenStorage:</w:t>
+        <w:t>google-auth.html already writes the same keys as current tokenStorage:</w:t>
       </w:r>
     </w:p>
     <w:tbl>
@@ -1037,7 +1237,7 @@
                 <w:b/>
                 <w:sz w:val="20"/>
               </w:rPr>
-              <w:t>Key</w:t>
+              <w:t>sessionStorage key</w:t>
             </w:r>
           </w:p>
         </w:tc>
@@ -1189,7 +1389,7 @@
                 <w:b w:val="0"/>
                 <w:sz w:val="20"/>
               </w:rPr>
-              <w:t>cleared; refill via GET /me</w:t>
+              <w:t>cleared — refill with GET /me</w:t>
             </w:r>
           </w:p>
         </w:tc>
@@ -1206,7 +1406,7 @@
           <w:b w:val="0"/>
           <w:sz w:val="22"/>
         </w:rPr>
-        <w:t>After landing on /, call GET {AUTH}/me with Authorization: Bearer &lt;accessToken&gt; and hydrate Redux / auth context.</w:t>
+        <w:t>On app load, if accessToken exists, call GET {AUTH}/me with Authorization: Bearer &lt;accessToken&gt; and put the user into Redux / auth context.</w:t>
       </w:r>
     </w:p>
     <w:p>
@@ -1214,7 +1414,85 @@
         <w:pStyle w:val="Heading1"/>
       </w:pPr>
       <w:r>
-        <w:t>6. Google Cloud Console checklist</w:t>
+        <w:t>4. End-to-end Google flow (after FE change)</w:t>
+      </w:r>
+    </w:p>
+    <w:p>
+      <w:pPr>
+        <w:spacing w:before="80" w:after="160"/>
+        <w:shd w:fill="F5F5F5" w:val="clear"/>
+      </w:pPr>
+      <w:r>
+        <w:rPr>
+          <w:rFonts w:ascii="Consolas" w:hAnsi="Consolas"/>
+          <w:b w:val="0"/>
+          <w:sz w:val="18"/>
+        </w:rPr>
+        <w:t>User clicks Continue with Google</w:t>
+        <w:br/>
+      </w:r>
+      <w:r>
+        <w:rPr>
+          <w:rFonts w:ascii="Consolas" w:hAnsi="Consolas"/>
+          <w:b w:val="0"/>
+          <w:sz w:val="18"/>
+        </w:rPr>
+        <w:t xml:space="preserve">  → GET {AUTH}/google/start?role=client&amp;returnTo=https://nexuslexis.law</w:t>
+        <w:br/>
+      </w:r>
+      <w:r>
+        <w:rPr>
+          <w:rFonts w:ascii="Consolas" w:hAnsi="Consolas"/>
+          <w:b w:val="0"/>
+          <w:sz w:val="18"/>
+        </w:rPr>
+        <w:t xml:space="preserve">  → Google consent</w:t>
+        <w:br/>
+      </w:r>
+      <w:r>
+        <w:rPr>
+          <w:rFonts w:ascii="Consolas" w:hAnsi="Consolas"/>
+          <w:b w:val="0"/>
+          <w:sz w:val="18"/>
+        </w:rPr>
+        <w:t xml:space="preserve">  → GET {AUTH}/google/callback?code=…</w:t>
+        <w:br/>
+      </w:r>
+      <w:r>
+        <w:rPr>
+          <w:rFonts w:ascii="Consolas" w:hAnsi="Consolas"/>
+          <w:b w:val="0"/>
+          <w:sz w:val="18"/>
+        </w:rPr>
+        <w:t xml:space="preserve">  → 302 https://nexuslexis.law/google-auth.html?token=…&amp;refreshToken=…</w:t>
+        <w:br/>
+      </w:r>
+      <w:r>
+        <w:rPr>
+          <w:rFonts w:ascii="Consolas" w:hAnsi="Consolas"/>
+          <w:b w:val="0"/>
+          <w:sz w:val="18"/>
+        </w:rPr>
+        <w:t xml:space="preserve">  → page writes sessionStorage</w:t>
+        <w:br/>
+      </w:r>
+      <w:r>
+        <w:rPr>
+          <w:rFonts w:ascii="Consolas" w:hAnsi="Consolas"/>
+          <w:b w:val="0"/>
+          <w:sz w:val="18"/>
+        </w:rPr>
+        <w:t xml:space="preserve">  → redirect /</w:t>
+        <w:br/>
+      </w:r>
+      <w:r>
+        <w:rPr>
+          <w:rFonts w:ascii="Consolas" w:hAnsi="Consolas"/>
+          <w:b w:val="0"/>
+          <w:sz w:val="18"/>
+        </w:rPr>
+        <w:t xml:space="preserve">  → React sees accessToken → GET /me → logged in</w:t>
+        <w:br/>
       </w:r>
     </w:p>
     <w:p>
@@ -1227,15 +1505,56 @@
           <w:b w:val="0"/>
           <w:sz w:val="22"/>
         </w:rPr>
-        <w:t>OAuth client type: Web application</w:t>
+        <w:t>Error return:</w:t>
       </w:r>
     </w:p>
     <w:p>
       <w:pPr>
-        <w:pStyle w:val="Heading2"/>
+        <w:spacing w:before="80" w:after="160"/>
+        <w:shd w:fill="F5F5F5" w:val="clear"/>
       </w:pPr>
       <w:r>
-        <w:t>Authorized JavaScript origins</w:t>
+        <w:rPr>
+          <w:rFonts w:ascii="Consolas" w:hAnsi="Consolas"/>
+          <w:b w:val="0"/>
+          <w:sz w:val="18"/>
+        </w:rPr>
+        <w:t>/google-auth.html?googleError=&lt;message&gt;&amp;next=/login</w:t>
+        <w:br/>
+      </w:r>
+    </w:p>
+    <w:p>
+      <w:pPr>
+        <w:pStyle w:val="Heading1"/>
+      </w:pPr>
+      <w:r>
+        <w:t>5. Google Cloud Console (FE + backend shared client)</w:t>
+      </w:r>
+    </w:p>
+    <w:p>
+      <w:pPr>
+        <w:spacing w:after="120"/>
+      </w:pPr>
+      <w:r>
+        <w:rPr>
+          <w:rFonts w:ascii="Calibri" w:hAnsi="Calibri"/>
+          <w:b w:val="0"/>
+          <w:sz w:val="22"/>
+        </w:rPr>
+        <w:t>OAuth type: Web application. FE uses Client ID only. Secret stays on Vercel Auth.</w:t>
+      </w:r>
+    </w:p>
+    <w:p>
+      <w:pPr>
+        <w:spacing w:after="120"/>
+      </w:pPr>
+      <w:r>
+        <w:rPr>
+          <w:rFonts w:ascii="Calibri" w:hAnsi="Calibri"/>
+          <w:b w:val="0"/>
+          <w:sz w:val="22"/>
+        </w:rPr>
+        <w:t>Authorized JavaScript origins (no trailing slash):</w:t>
       </w:r>
     </w:p>
     <w:p>
@@ -1287,15 +1606,20 @@
           <w:b w:val="0"/>
           <w:sz w:val="22"/>
         </w:rPr>
-        <w:t>http://localhost:5173 (local)</w:t>
+        <w:t>http://localhost:5173</w:t>
       </w:r>
     </w:p>
     <w:p>
       <w:pPr>
-        <w:pStyle w:val="Heading2"/>
+        <w:spacing w:after="120"/>
       </w:pPr>
       <w:r>
-        <w:t>Authorized redirect URIs (exact — Auth callback, not the FE domain)</w:t>
+        <w:rPr>
+          <w:rFonts w:ascii="Calibri" w:hAnsi="Calibri"/>
+          <w:b w:val="0"/>
+          <w:sz w:val="22"/>
+        </w:rPr>
+        <w:t>Authorized redirect URI (exact — Auth callback, NOT the website):</w:t>
       </w:r>
     </w:p>
     <w:p>
@@ -1321,7 +1645,316 @@
           <w:b w:val="0"/>
           <w:sz w:val="22"/>
         </w:rPr>
-        <w:t>Client ID in FE must match Vercel env GOOGLE_CLIENT_ID on Auth.</w:t>
+        <w:t>If you rotated a new Client ID, put the same ID in FE env AND Vercel GOOGLE_CLIENT_ID. Put the new secret only in Vercel GOOGLE_CLIENT_SECRET. Do not put the secret in the frontend repo or Hostinger files.</w:t>
+      </w:r>
+    </w:p>
+    <w:p>
+      <w:pPr>
+        <w:spacing w:after="120"/>
+      </w:pPr>
+      <w:r>
+        <w:rPr>
+          <w:rFonts w:ascii="Calibri" w:hAnsi="Calibri"/>
+          <w:b w:val="0"/>
+          <w:sz w:val="22"/>
+        </w:rPr>
+        <w:t>Live Hostinger bundle Client ID still: 925512874310-duojhjmbplliooe0mqlgm532fogmq40g.apps.googleusercontent.com</w:t>
+      </w:r>
+    </w:p>
+    <w:p>
+      <w:pPr>
+        <w:pStyle w:val="Heading1"/>
+      </w:pPr>
+      <w:r>
+        <w:t>6. Issue B — Lawyer rejected but FE shows Pending / cannot re-apply</w:t>
+      </w:r>
+    </w:p>
+    <w:p>
+      <w:pPr>
+        <w:spacing w:after="120"/>
+      </w:pPr>
+      <w:r>
+        <w:rPr>
+          <w:rFonts w:ascii="Calibri" w:hAnsi="Calibri"/>
+          <w:b w:val="0"/>
+          <w:sz w:val="22"/>
+        </w:rPr>
+        <w:t>Backend already sets verification to Rejected and allows re-apply. FE must read these fields from login, refresh, and GET /me (not a cached JWT-only Pending flag).</w:t>
+      </w:r>
+    </w:p>
+    <w:p>
+      <w:pPr>
+        <w:spacing w:before="80" w:after="160"/>
+        <w:shd w:fill="F5F5F5" w:val="clear"/>
+      </w:pPr>
+      <w:r>
+        <w:rPr>
+          <w:rFonts w:ascii="Consolas" w:hAnsi="Consolas"/>
+          <w:b w:val="0"/>
+          <w:sz w:val="18"/>
+        </w:rPr>
+        <w:t>{</w:t>
+        <w:br/>
+      </w:r>
+      <w:r>
+        <w:rPr>
+          <w:rFonts w:ascii="Consolas" w:hAnsi="Consolas"/>
+          <w:b w:val="0"/>
+          <w:sz w:val="18"/>
+        </w:rPr>
+        <w:t xml:space="preserve">  "user": {</w:t>
+        <w:br/>
+      </w:r>
+      <w:r>
+        <w:rPr>
+          <w:rFonts w:ascii="Consolas" w:hAnsi="Consolas"/>
+          <w:b w:val="0"/>
+          <w:sz w:val="18"/>
+        </w:rPr>
+        <w:t xml:space="preserve">    "verificationStatus": "Rejected",</w:t>
+        <w:br/>
+      </w:r>
+      <w:r>
+        <w:rPr>
+          <w:rFonts w:ascii="Consolas" w:hAnsi="Consolas"/>
+          <w:b w:val="0"/>
+          <w:sz w:val="18"/>
+        </w:rPr>
+        <w:t xml:space="preserve">    "canAccessDashboard": false,</w:t>
+        <w:br/>
+      </w:r>
+      <w:r>
+        <w:rPr>
+          <w:rFonts w:ascii="Consolas" w:hAnsi="Consolas"/>
+          <w:b w:val="0"/>
+          <w:sz w:val="18"/>
+        </w:rPr>
+        <w:t xml:space="preserve">    "nextStep": "complete_lawyer_application",</w:t>
+        <w:br/>
+      </w:r>
+      <w:r>
+        <w:rPr>
+          <w:rFonts w:ascii="Consolas" w:hAnsi="Consolas"/>
+          <w:b w:val="0"/>
+          <w:sz w:val="18"/>
+        </w:rPr>
+        <w:t xml:space="preserve">    "pendingVerificationRole": null,</w:t>
+        <w:br/>
+      </w:r>
+      <w:r>
+        <w:rPr>
+          <w:rFonts w:ascii="Consolas" w:hAnsi="Consolas"/>
+          <w:b w:val="0"/>
+          <w:sz w:val="18"/>
+        </w:rPr>
+        <w:t xml:space="preserve">    "canReapply": true,</w:t>
+        <w:br/>
+      </w:r>
+      <w:r>
+        <w:rPr>
+          <w:rFonts w:ascii="Consolas" w:hAnsi="Consolas"/>
+          <w:b w:val="0"/>
+          <w:sz w:val="18"/>
+        </w:rPr>
+        <w:t xml:space="preserve">    "canApplyAsLawyer": true,</w:t>
+        <w:br/>
+      </w:r>
+      <w:r>
+        <w:rPr>
+          <w:rFonts w:ascii="Consolas" w:hAnsi="Consolas"/>
+          <w:b w:val="0"/>
+          <w:sz w:val="18"/>
+        </w:rPr>
+        <w:t xml:space="preserve">    "message": "Your lawyer application was rejected. You can update your details and apply for verification again."</w:t>
+        <w:br/>
+      </w:r>
+      <w:r>
+        <w:rPr>
+          <w:rFonts w:ascii="Consolas" w:hAnsi="Consolas"/>
+          <w:b w:val="0"/>
+          <w:sz w:val="18"/>
+        </w:rPr>
+        <w:t xml:space="preserve">  },</w:t>
+        <w:br/>
+      </w:r>
+      <w:r>
+        <w:rPr>
+          <w:rFonts w:ascii="Consolas" w:hAnsi="Consolas"/>
+          <w:b w:val="0"/>
+          <w:sz w:val="18"/>
+        </w:rPr>
+        <w:t xml:space="preserve">  "accountAccess": { "same fields" }</w:t>
+        <w:br/>
+      </w:r>
+      <w:r>
+        <w:rPr>
+          <w:rFonts w:ascii="Consolas" w:hAnsi="Consolas"/>
+          <w:b w:val="0"/>
+          <w:sz w:val="18"/>
+        </w:rPr>
+        <w:t>}</w:t>
+        <w:br/>
+      </w:r>
+    </w:p>
+    <w:tbl>
+      <w:tblPr>
+        <w:tblStyle w:val="TableGrid"/>
+        <w:tblW w:type="auto" w:w="0"/>
+        <w:tblLook w:firstColumn="1" w:firstRow="1" w:lastColumn="0" w:lastRow="0" w:noHBand="0" w:noVBand="1" w:val="04A0"/>
+      </w:tblPr>
+      <w:tblGrid>
+        <w:gridCol w:w="4896"/>
+        <w:gridCol w:w="4896"/>
+      </w:tblGrid>
+      <w:tr>
+        <w:tc>
+          <w:tcPr>
+            <w:tcW w:type="dxa" w:w="4896"/>
+          </w:tcPr>
+          <w:p>
+            <w:r/>
+            <w:r>
+              <w:rPr>
+                <w:rFonts w:ascii="Calibri" w:hAnsi="Calibri"/>
+                <w:b/>
+                <w:sz w:val="20"/>
+              </w:rPr>
+              <w:t>Condition</w:t>
+            </w:r>
+          </w:p>
+        </w:tc>
+        <w:tc>
+          <w:tcPr>
+            <w:tcW w:type="dxa" w:w="4896"/>
+          </w:tcPr>
+          <w:p>
+            <w:r/>
+            <w:r>
+              <w:rPr>
+                <w:rFonts w:ascii="Calibri" w:hAnsi="Calibri"/>
+                <w:b/>
+                <w:sz w:val="20"/>
+              </w:rPr>
+              <w:t>UI</w:t>
+            </w:r>
+          </w:p>
+        </w:tc>
+      </w:tr>
+      <w:tr>
+        <w:tc>
+          <w:tcPr>
+            <w:tcW w:type="dxa" w:w="4896"/>
+          </w:tcPr>
+          <w:p>
+            <w:r/>
+            <w:r>
+              <w:rPr>
+                <w:rFonts w:ascii="Calibri" w:hAnsi="Calibri"/>
+                <w:b w:val="0"/>
+                <w:sz w:val="20"/>
+              </w:rPr>
+              <w:t>nextStep === verification_pending OR pendingVerificationRole is set</w:t>
+            </w:r>
+          </w:p>
+        </w:tc>
+        <w:tc>
+          <w:tcPr>
+            <w:tcW w:type="dxa" w:w="4896"/>
+          </w:tcPr>
+          <w:p>
+            <w:r/>
+            <w:r>
+              <w:rPr>
+                <w:rFonts w:ascii="Calibri" w:hAnsi="Calibri"/>
+                <w:b w:val="0"/>
+                <w:sz w:val="20"/>
+              </w:rPr>
+              <w:t>Pending verification screen ONLY</w:t>
+            </w:r>
+          </w:p>
+        </w:tc>
+      </w:tr>
+      <w:tr>
+        <w:tc>
+          <w:tcPr>
+            <w:tcW w:type="dxa" w:w="4896"/>
+          </w:tcPr>
+          <w:p>
+            <w:r/>
+            <w:r>
+              <w:rPr>
+                <w:rFonts w:ascii="Calibri" w:hAnsi="Calibri"/>
+                <w:b w:val="0"/>
+                <w:sz w:val="20"/>
+              </w:rPr>
+              <w:t>verificationStatus === Rejected OR canReapply === true</w:t>
+            </w:r>
+          </w:p>
+        </w:tc>
+        <w:tc>
+          <w:tcPr>
+            <w:tcW w:type="dxa" w:w="4896"/>
+          </w:tcPr>
+          <w:p>
+            <w:r/>
+            <w:r>
+              <w:rPr>
+                <w:rFonts w:ascii="Calibri" w:hAnsi="Calibri"/>
+                <w:b w:val="0"/>
+                <w:sz w:val="20"/>
+              </w:rPr>
+              <w:t>Show Rejected + open lawyer apply form again</w:t>
+            </w:r>
+          </w:p>
+        </w:tc>
+      </w:tr>
+      <w:tr>
+        <w:tc>
+          <w:tcPr>
+            <w:tcW w:type="dxa" w:w="4896"/>
+          </w:tcPr>
+          <w:p>
+            <w:r/>
+            <w:r>
+              <w:rPr>
+                <w:rFonts w:ascii="Calibri" w:hAnsi="Calibri"/>
+                <w:b w:val="0"/>
+                <w:sz w:val="20"/>
+              </w:rPr>
+              <w:t>canApplyAsLawyer === true</w:t>
+            </w:r>
+          </w:p>
+        </w:tc>
+        <w:tc>
+          <w:tcPr>
+            <w:tcW w:type="dxa" w:w="4896"/>
+          </w:tcPr>
+          <w:p>
+            <w:r/>
+            <w:r>
+              <w:rPr>
+                <w:rFonts w:ascii="Calibri" w:hAnsi="Calibri"/>
+                <w:b w:val="0"/>
+                <w:sz w:val="20"/>
+              </w:rPr>
+              <w:t>Enable POST /profile/lawyer/apply (re-apply)</w:t>
+            </w:r>
+          </w:p>
+        </w:tc>
+      </w:tr>
+    </w:tbl>
+    <w:p/>
+    <w:p>
+      <w:pPr>
+        <w:spacing w:after="120"/>
+      </w:pPr>
+      <w:r>
+        <w:rPr>
+          <w:rFonts w:ascii="Calibri" w:hAnsi="Calibri"/>
+          <w:b w:val="0"/>
+          <w:sz w:val="22"/>
+        </w:rPr>
+        <w:t>Do not treat Rejected as Pending. Do not hide apply just because a lawyer_profile row already exists. Same pattern for CA: canApplyAsCA / canReapply.</w:t>
       </w:r>
     </w:p>
     <w:p>
@@ -1501,7 +2134,7 @@
                 <w:b w:val="0"/>
                 <w:sz w:val="20"/>
               </w:rPr>
-              <w:t>Includes googleAuth.recommendedMode: "redirect"</w:t>
+              <w:t>googleAuth.recommendedMode = redirect</w:t>
             </w:r>
           </w:p>
         </w:tc>
@@ -1551,7 +2184,7 @@
                 <w:b w:val="0"/>
                 <w:sz w:val="20"/>
               </w:rPr>
-              <w:t>Primary Google entry</w:t>
+              <w:t>PRIMARY Google entry on Hostinger</w:t>
             </w:r>
           </w:p>
         </w:tc>
@@ -1601,7 +2234,7 @@
                 <w:b w:val="0"/>
                 <w:sz w:val="20"/>
               </w:rPr>
-              <w:t>Google → FE (do not call from FE)</w:t>
+              <w:t>Google hits this — FE must not call it</w:t>
             </w:r>
           </w:p>
         </w:tc>
@@ -1651,7 +2284,7 @@
                 <w:b w:val="0"/>
                 <w:sz w:val="20"/>
               </w:rPr>
-              <w:t>Legacy GIS only — avoid on Hostinger</w:t>
+              <w:t>Legacy GIS — do not use as primary on Hostinger</w:t>
             </w:r>
           </w:p>
         </w:tc>
@@ -1701,7 +2334,7 @@
                 <w:b w:val="0"/>
                 <w:sz w:val="20"/>
               </w:rPr>
-              <w:t>Current user + verification / re-apply flags</w:t>
+              <w:t>User + verification / re-apply flags</w:t>
             </w:r>
           </w:p>
         </w:tc>
@@ -1806,199 +2439,10 @@
           </w:p>
         </w:tc>
       </w:tr>
-    </w:tbl>
-    <w:p/>
-    <w:p>
-      <w:pPr>
-        <w:pStyle w:val="Heading1"/>
-      </w:pPr>
-      <w:r>
-        <w:t>8. Related: lawyer reject → show Rejected + allow re-apply</w:t>
-      </w:r>
-    </w:p>
-    <w:p>
-      <w:pPr>
-        <w:spacing w:after="120"/>
-      </w:pPr>
-      <w:r>
-        <w:rPr>
-          <w:rFonts w:ascii="Calibri" w:hAnsi="Calibri"/>
-          <w:b w:val="0"/>
-          <w:sz w:val="22"/>
-        </w:rPr>
-        <w:t>After admin rejects a lawyer, Auth returns (login / refresh / /me):</w:t>
-      </w:r>
-    </w:p>
-    <w:p>
-      <w:pPr>
-        <w:spacing w:before="80" w:after="160"/>
-        <w:shd w:fill="F5F5F5" w:val="clear"/>
-      </w:pPr>
-      <w:r>
-        <w:rPr>
-          <w:rFonts w:ascii="Consolas" w:hAnsi="Consolas"/>
-          <w:b w:val="0"/>
-          <w:sz w:val="18"/>
-        </w:rPr>
-        <w:t>{</w:t>
-        <w:br/>
-      </w:r>
-      <w:r>
-        <w:rPr>
-          <w:rFonts w:ascii="Consolas" w:hAnsi="Consolas"/>
-          <w:b w:val="0"/>
-          <w:sz w:val="18"/>
-        </w:rPr>
-        <w:t xml:space="preserve">  "user": {</w:t>
-        <w:br/>
-      </w:r>
-      <w:r>
-        <w:rPr>
-          <w:rFonts w:ascii="Consolas" w:hAnsi="Consolas"/>
-          <w:b w:val="0"/>
-          <w:sz w:val="18"/>
-        </w:rPr>
-        <w:t xml:space="preserve">    "verificationStatus": "Rejected",</w:t>
-        <w:br/>
-      </w:r>
-      <w:r>
-        <w:rPr>
-          <w:rFonts w:ascii="Consolas" w:hAnsi="Consolas"/>
-          <w:b w:val="0"/>
-          <w:sz w:val="18"/>
-        </w:rPr>
-        <w:t xml:space="preserve">    "canAccessDashboard": false,</w:t>
-        <w:br/>
-      </w:r>
-      <w:r>
-        <w:rPr>
-          <w:rFonts w:ascii="Consolas" w:hAnsi="Consolas"/>
-          <w:b w:val="0"/>
-          <w:sz w:val="18"/>
-        </w:rPr>
-        <w:t xml:space="preserve">    "nextStep": "complete_lawyer_application",</w:t>
-        <w:br/>
-      </w:r>
-      <w:r>
-        <w:rPr>
-          <w:rFonts w:ascii="Consolas" w:hAnsi="Consolas"/>
-          <w:b w:val="0"/>
-          <w:sz w:val="18"/>
-        </w:rPr>
-        <w:t xml:space="preserve">    "pendingVerificationRole": null,</w:t>
-        <w:br/>
-      </w:r>
-      <w:r>
-        <w:rPr>
-          <w:rFonts w:ascii="Consolas" w:hAnsi="Consolas"/>
-          <w:b w:val="0"/>
-          <w:sz w:val="18"/>
-        </w:rPr>
-        <w:t xml:space="preserve">    "canReapply": true,</w:t>
-        <w:br/>
-      </w:r>
-      <w:r>
-        <w:rPr>
-          <w:rFonts w:ascii="Consolas" w:hAnsi="Consolas"/>
-          <w:b w:val="0"/>
-          <w:sz w:val="18"/>
-        </w:rPr>
-        <w:t xml:space="preserve">    "canApplyAsLawyer": true,</w:t>
-        <w:br/>
-      </w:r>
-      <w:r>
-        <w:rPr>
-          <w:rFonts w:ascii="Consolas" w:hAnsi="Consolas"/>
-          <w:b w:val="0"/>
-          <w:sz w:val="18"/>
-        </w:rPr>
-        <w:t xml:space="preserve">    "message": "Your lawyer application was rejected. You can update your details and apply for verification again."</w:t>
-        <w:br/>
-      </w:r>
-      <w:r>
-        <w:rPr>
-          <w:rFonts w:ascii="Consolas" w:hAnsi="Consolas"/>
-          <w:b w:val="0"/>
-          <w:sz w:val="18"/>
-        </w:rPr>
-        <w:t xml:space="preserve">  },</w:t>
-        <w:br/>
-      </w:r>
-      <w:r>
-        <w:rPr>
-          <w:rFonts w:ascii="Consolas" w:hAnsi="Consolas"/>
-          <w:b w:val="0"/>
-          <w:sz w:val="18"/>
-        </w:rPr>
-        <w:t xml:space="preserve">  "accountAccess": { "...same fields..." }</w:t>
-        <w:br/>
-      </w:r>
-      <w:r>
-        <w:rPr>
-          <w:rFonts w:ascii="Consolas" w:hAnsi="Consolas"/>
-          <w:b w:val="0"/>
-          <w:sz w:val="18"/>
-        </w:rPr>
-        <w:t>}</w:t>
-        <w:br/>
-      </w:r>
-    </w:p>
-    <w:p>
-      <w:pPr>
-        <w:pStyle w:val="Heading2"/>
-      </w:pPr>
-      <w:r>
-        <w:t>FE routing rules</w:t>
-      </w:r>
-    </w:p>
-    <w:tbl>
-      <w:tblPr>
-        <w:tblStyle w:val="TableGrid"/>
-        <w:tblW w:type="auto" w:w="0"/>
-        <w:tblLook w:firstColumn="1" w:firstRow="1" w:lastColumn="0" w:lastRow="0" w:noHBand="0" w:noVBand="1" w:val="04A0"/>
-      </w:tblPr>
-      <w:tblGrid>
-        <w:gridCol w:w="4896"/>
-        <w:gridCol w:w="4896"/>
-      </w:tblGrid>
       <w:tr>
         <w:tc>
           <w:tcPr>
-            <w:tcW w:type="dxa" w:w="4896"/>
-          </w:tcPr>
-          <w:p>
-            <w:r/>
-            <w:r>
-              <w:rPr>
-                <w:rFonts w:ascii="Calibri" w:hAnsi="Calibri"/>
-                <w:b/>
-                <w:sz w:val="20"/>
-              </w:rPr>
-              <w:t>Condition</w:t>
-            </w:r>
-          </w:p>
-        </w:tc>
-        <w:tc>
-          <w:tcPr>
-            <w:tcW w:type="dxa" w:w="4896"/>
-          </w:tcPr>
-          <w:p>
-            <w:r/>
-            <w:r>
-              <w:rPr>
-                <w:rFonts w:ascii="Calibri" w:hAnsi="Calibri"/>
-                <w:b/>
-                <w:sz w:val="20"/>
-              </w:rPr>
-              <w:t>UI</w:t>
-            </w:r>
-          </w:p>
-        </w:tc>
-      </w:tr>
-      <w:tr>
-        <w:tc>
-          <w:tcPr>
-            <w:tcW w:type="dxa" w:w="4896"/>
+            <w:tcW w:type="dxa" w:w="3264"/>
           </w:tcPr>
           <w:p>
             <w:r/>
@@ -2008,13 +2452,13 @@
                 <w:b w:val="0"/>
                 <w:sz w:val="20"/>
               </w:rPr>
-              <w:t>nextStep === 'verification_pending' OR pendingVerificationRole set</w:t>
+              <w:t>POST</w:t>
             </w:r>
           </w:p>
         </w:tc>
         <w:tc>
           <w:tcPr>
-            <w:tcW w:type="dxa" w:w="4896"/>
+            <w:tcW w:type="dxa" w:w="3264"/>
           </w:tcPr>
           <w:p>
             <w:r/>
@@ -2024,15 +2468,13 @@
                 <w:b w:val="0"/>
                 <w:sz w:val="20"/>
               </w:rPr>
-              <w:t>Pending verification screen only</w:t>
+              <w:t>/profile/lawyer/apply</w:t>
             </w:r>
           </w:p>
         </w:tc>
-      </w:tr>
-      <w:tr>
         <w:tc>
           <w:tcPr>
-            <w:tcW w:type="dxa" w:w="4896"/>
+            <w:tcW w:type="dxa" w:w="3264"/>
           </w:tcPr>
           <w:p>
             <w:r/>
@@ -2042,57 +2484,7 @@
                 <w:b w:val="0"/>
                 <w:sz w:val="20"/>
               </w:rPr>
-              <w:t>verificationStatus === 'Rejected' OR canReapply === true</w:t>
-            </w:r>
-          </w:p>
-        </w:tc>
-        <w:tc>
-          <w:tcPr>
-            <w:tcW w:type="dxa" w:w="4896"/>
-          </w:tcPr>
-          <w:p>
-            <w:r/>
-            <w:r>
-              <w:rPr>
-                <w:rFonts w:ascii="Calibri" w:hAnsi="Calibri"/>
-                <w:b w:val="0"/>
-                <w:sz w:val="20"/>
-              </w:rPr>
-              <w:t>Rejected message + re-open lawyer apply form</w:t>
-            </w:r>
-          </w:p>
-        </w:tc>
-      </w:tr>
-      <w:tr>
-        <w:tc>
-          <w:tcPr>
-            <w:tcW w:type="dxa" w:w="4896"/>
-          </w:tcPr>
-          <w:p>
-            <w:r/>
-            <w:r>
-              <w:rPr>
-                <w:rFonts w:ascii="Calibri" w:hAnsi="Calibri"/>
-                <w:b w:val="0"/>
-                <w:sz w:val="20"/>
-              </w:rPr>
-              <w:t>canApplyAsLawyer === true</w:t>
-            </w:r>
-          </w:p>
-        </w:tc>
-        <w:tc>
-          <w:tcPr>
-            <w:tcW w:type="dxa" w:w="4896"/>
-          </w:tcPr>
-          <w:p>
-            <w:r/>
-            <w:r>
-              <w:rPr>
-                <w:rFonts w:ascii="Calibri" w:hAnsi="Calibri"/>
-                <w:b w:val="0"/>
-                <w:sz w:val="20"/>
-              </w:rPr>
-              <w:t>Enable POST /profile/lawyer/apply again</w:t>
+              <w:t>Lawyer apply / re-apply after reject</w:t>
             </w:r>
           </w:p>
         </w:tc>
@@ -2101,36 +2493,10 @@
     <w:p/>
     <w:p>
       <w:pPr>
-        <w:spacing w:after="120"/>
-      </w:pPr>
-      <w:r>
-        <w:rPr>
-          <w:rFonts w:ascii="Calibri" w:hAnsi="Calibri"/>
-          <w:b w:val="0"/>
-          <w:sz w:val="22"/>
-        </w:rPr>
-        <w:t>Do not treat Rejected as Pending.</w:t>
-      </w:r>
-    </w:p>
-    <w:p>
-      <w:pPr>
-        <w:spacing w:after="120"/>
-      </w:pPr>
-      <w:r>
-        <w:rPr>
-          <w:rFonts w:ascii="Calibri" w:hAnsi="Calibri"/>
-          <w:b w:val="0"/>
-          <w:sz w:val="22"/>
-        </w:rPr>
-        <w:t>Do not gate apply only on ApplicationRequired — rejected users keep a profile row but must re-apply.</w:t>
-      </w:r>
-    </w:p>
-    <w:p>
-      <w:pPr>
         <w:pStyle w:val="Heading1"/>
       </w:pPr>
       <w:r>
-        <w:t>9. Acceptance checklist</w:t>
+        <w:t>8. Acceptance checklist</w:t>
       </w:r>
     </w:p>
     <w:p>
@@ -2169,7 +2535,7 @@
           <w:b w:val="0"/>
           <w:sz w:val="22"/>
         </w:rPr>
-        <w:t>☐  /login and /signup return 200 (hard refresh)</w:t>
+        <w:t>☐  /login and /signup return 200 on nexuslexis.law (hard refresh)</w:t>
       </w:r>
     </w:p>
     <w:p>
@@ -2182,7 +2548,7 @@
           <w:b w:val="0"/>
           <w:sz w:val="22"/>
         </w:rPr>
-        <w:t>☐  Google button uses window.location.href → /google/start (no GIS popup on Hostinger)</w:t>
+        <w:t>☐  google-auth.html returns 200</w:t>
       </w:r>
     </w:p>
     <w:p>
@@ -2195,7 +2561,7 @@
           <w:b w:val="0"/>
           <w:sz w:val="22"/>
         </w:rPr>
-        <w:t>☐  Google signup completes → lands on site logged in</w:t>
+        <w:t>☐  New JS bundle on Hostinger (not still index-BAz4ttsT.js)</w:t>
       </w:r>
     </w:p>
     <w:p>
@@ -2208,7 +2574,7 @@
           <w:b w:val="0"/>
           <w:sz w:val="22"/>
         </w:rPr>
-        <w:t>☐  Lawyer rejected in admin → FE shows Rejected + can submit apply again</w:t>
+        <w:t>☐  Google button uses window.location.href to /google/start — no GIS popup on Hostinger</w:t>
       </w:r>
     </w:p>
     <w:p>
@@ -2221,7 +2587,59 @@
           <w:b w:val="0"/>
           <w:sz w:val="22"/>
         </w:rPr>
-        <w:t>☐  Google Console origins + redirect URI match section 6</w:t>
+        <w:t>☐  Google signup completes and lands logged in</w:t>
+      </w:r>
+    </w:p>
+    <w:p>
+      <w:pPr>
+        <w:pStyle w:val="ListBullet"/>
+      </w:pPr>
+      <w:r>
+        <w:rPr>
+          <w:rFonts w:ascii="Calibri" w:hAnsi="Calibri"/>
+          <w:b w:val="0"/>
+          <w:sz w:val="22"/>
+        </w:rPr>
+        <w:t>☐  GET /me after Google landing hydrates user</w:t>
+      </w:r>
+    </w:p>
+    <w:p>
+      <w:pPr>
+        <w:pStyle w:val="ListBullet"/>
+      </w:pPr>
+      <w:r>
+        <w:rPr>
+          <w:rFonts w:ascii="Calibri" w:hAnsi="Calibri"/>
+          <w:b w:val="0"/>
+          <w:sz w:val="22"/>
+        </w:rPr>
+        <w:t>☐  Lawyer rejected in admin → FE shows Rejected (not Pending) and apply works again</w:t>
+      </w:r>
+    </w:p>
+    <w:p>
+      <w:pPr>
+        <w:pStyle w:val="ListBullet"/>
+      </w:pPr>
+      <w:r>
+        <w:rPr>
+          <w:rFonts w:ascii="Calibri" w:hAnsi="Calibri"/>
+          <w:b w:val="0"/>
+          <w:sz w:val="22"/>
+        </w:rPr>
+        <w:t>☐  Google Console origins + redirect URI match section 5</w:t>
+      </w:r>
+    </w:p>
+    <w:p>
+      <w:pPr>
+        <w:pStyle w:val="ListBullet"/>
+      </w:pPr>
+      <w:r>
+        <w:rPr>
+          <w:rFonts w:ascii="Calibri" w:hAnsi="Calibri"/>
+          <w:b w:val="0"/>
+          <w:sz w:val="22"/>
+        </w:rPr>
+        <w:t>☐  Client secret is NOT in frontend env or repo</w:t>
       </w:r>
     </w:p>
     <w:p>
@@ -2229,7 +2647,7 @@
         <w:pStyle w:val="Heading1"/>
       </w:pPr>
       <w:r>
-        <w:t>10. Troubleshooting</w:t>
+        <w:t>9. Troubleshooting</w:t>
       </w:r>
     </w:p>
     <w:tbl>
@@ -2271,7 +2689,7 @@
                 <w:b/>
                 <w:sz w:val="20"/>
               </w:rPr>
-              <w:t>Fix</w:t>
+              <w:t>Cause / fix</w:t>
             </w:r>
           </w:p>
         </w:tc>
@@ -2305,7 +2723,7 @@
                 <w:b w:val="0"/>
                 <w:sz w:val="20"/>
               </w:rPr>
-              <w:t>Add site origin to Google Console JS origins</w:t>
+              <w:t>Add https://nexuslexis.law and https://www.nexuslexis.law as JS origins</w:t>
             </w:r>
           </w:p>
         </w:tc>
@@ -2323,7 +2741,7 @@
                 <w:b w:val="0"/>
                 <w:sz w:val="20"/>
               </w:rPr>
-              <w:t>Unable to reach the server / RTK FETCH_ERROR</w:t>
+              <w:t>Unable to reach the server / FETCH_ERROR</w:t>
             </w:r>
           </w:p>
         </w:tc>
@@ -2339,7 +2757,7 @@
                 <w:b w:val="0"/>
                 <w:sz w:val="20"/>
               </w:rPr>
-              <w:t>Stop using /google/token; use /google/start</w:t>
+              <w:t>Stop using POST /google/token on Hostinger; use /google/start</w:t>
             </w:r>
           </w:p>
         </w:tc>
@@ -2357,7 +2775,7 @@
                 <w:b w:val="0"/>
                 <w:sz w:val="20"/>
               </w:rPr>
-              <w:t>Google finishes → blank / Hostinger 404</w:t>
+              <w:t>/login or /signup is Hostinger 404</w:t>
             </w:r>
           </w:p>
         </w:tc>
@@ -2373,7 +2791,7 @@
                 <w:b w:val="0"/>
                 <w:sz w:val="20"/>
               </w:rPr>
-              <w:t>Upload .htaccess + google-auth.html</w:t>
+              <w:t>Upload .htaccess; confirm it is in public_html</w:t>
             </w:r>
           </w:p>
         </w:tc>
@@ -2391,7 +2809,7 @@
                 <w:b w:val="0"/>
                 <w:sz w:val="20"/>
               </w:rPr>
-              <w:t>Stuck on “Signing you in…”</w:t>
+              <w:t>Google finishes then 404</w:t>
             </w:r>
           </w:p>
         </w:tc>
@@ -2407,7 +2825,41 @@
                 <w:b w:val="0"/>
                 <w:sz w:val="20"/>
               </w:rPr>
-              <w:t>Check google-auth.html query has token; check sessionStorage</w:t>
+              <w:t>Upload google-auth.html; Auth now redirects there, not /login</w:t>
+            </w:r>
+          </w:p>
+        </w:tc>
+      </w:tr>
+      <w:tr>
+        <w:tc>
+          <w:tcPr>
+            <w:tcW w:type="dxa" w:w="4896"/>
+          </w:tcPr>
+          <w:p>
+            <w:r/>
+            <w:r>
+              <w:rPr>
+                <w:rFonts w:ascii="Calibri" w:hAnsi="Calibri"/>
+                <w:b w:val="0"/>
+                <w:sz w:val="20"/>
+              </w:rPr>
+              <w:t>Stuck on Signing you in…</w:t>
+            </w:r>
+          </w:p>
+        </w:tc>
+        <w:tc>
+          <w:tcPr>
+            <w:tcW w:type="dxa" w:w="4896"/>
+          </w:tcPr>
+          <w:p>
+            <w:r/>
+            <w:r>
+              <w:rPr>
+                <w:rFonts w:ascii="Calibri" w:hAnsi="Calibri"/>
+                <w:b w:val="0"/>
+                <w:sz w:val="20"/>
+              </w:rPr>
+              <w:t>URL must include token=; check sessionStorage keys</w:t>
             </w:r>
           </w:p>
         </w:tc>
@@ -2475,7 +2927,41 @@
                 <w:b w:val="0"/>
                 <w:sz w:val="20"/>
               </w:rPr>
-              <w:t>Only Auth callback URL in Google Console (see section 6)</w:t>
+              <w:t>Only Auth callback URL in Google Console (section 5)</w:t>
+            </w:r>
+          </w:p>
+        </w:tc>
+      </w:tr>
+      <w:tr>
+        <w:tc>
+          <w:tcPr>
+            <w:tcW w:type="dxa" w:w="4896"/>
+          </w:tcPr>
+          <w:p>
+            <w:r/>
+            <w:r>
+              <w:rPr>
+                <w:rFonts w:ascii="Calibri" w:hAnsi="Calibri"/>
+                <w:b w:val="0"/>
+                <w:sz w:val="20"/>
+              </w:rPr>
+              <w:t>Still old popup after deploy</w:t>
+            </w:r>
+          </w:p>
+        </w:tc>
+        <w:tc>
+          <w:tcPr>
+            <w:tcW w:type="dxa" w:w="4896"/>
+          </w:tcPr>
+          <w:p>
+            <w:r/>
+            <w:r>
+              <w:rPr>
+                <w:rFonts w:ascii="Calibri" w:hAnsi="Calibri"/>
+                <w:b w:val="0"/>
+                <w:sz w:val="20"/>
+              </w:rPr>
+              <w:t>Hostinger still serving old bundle index-BAz4ttsT.js — clear CDN/cache and re-upload dist</w:t>
             </w:r>
           </w:p>
         </w:tc>
@@ -2487,7 +2973,7 @@
         <w:pStyle w:val="Heading1"/>
       </w:pPr>
       <w:r>
-        <w:t>11. Files in this backend repo</w:t>
+        <w:t>10. Files from backend repo</w:t>
       </w:r>
     </w:p>
     <w:tbl>
@@ -2649,74 +3135,6 @@
                 <w:b w:val="0"/>
                 <w:sz w:val="20"/>
               </w:rPr>
-              <w:t>docs/Frontend_Google_Redirect_Fix.md</w:t>
-            </w:r>
-          </w:p>
-        </w:tc>
-        <w:tc>
-          <w:tcPr>
-            <w:tcW w:type="dxa" w:w="4896"/>
-          </w:tcPr>
-          <w:p>
-            <w:r/>
-            <w:r>
-              <w:rPr>
-                <w:rFonts w:ascii="Calibri" w:hAnsi="Calibri"/>
-                <w:b w:val="0"/>
-                <w:sz w:val="20"/>
-              </w:rPr>
-              <w:t>Short version of this handoff</w:t>
-            </w:r>
-          </w:p>
-        </w:tc>
-      </w:tr>
-      <w:tr>
-        <w:tc>
-          <w:tcPr>
-            <w:tcW w:type="dxa" w:w="4896"/>
-          </w:tcPr>
-          <w:p>
-            <w:r/>
-            <w:r>
-              <w:rPr>
-                <w:rFonts w:ascii="Calibri" w:hAnsi="Calibri"/>
-                <w:b w:val="0"/>
-                <w:sz w:val="20"/>
-              </w:rPr>
-              <w:t>docs/Frontend_Hostinger_Google_SignIn_Handoff.md</w:t>
-            </w:r>
-          </w:p>
-        </w:tc>
-        <w:tc>
-          <w:tcPr>
-            <w:tcW w:type="dxa" w:w="4896"/>
-          </w:tcPr>
-          <w:p>
-            <w:r/>
-            <w:r>
-              <w:rPr>
-                <w:rFonts w:ascii="Calibri" w:hAnsi="Calibri"/>
-                <w:b w:val="0"/>
-                <w:sz w:val="20"/>
-              </w:rPr>
-              <w:t>Markdown source of this document</w:t>
-            </w:r>
-          </w:p>
-        </w:tc>
-      </w:tr>
-      <w:tr>
-        <w:tc>
-          <w:tcPr>
-            <w:tcW w:type="dxa" w:w="4896"/>
-          </w:tcPr>
-          <w:p>
-            <w:r/>
-            <w:r>
-              <w:rPr>
-                <w:rFonts w:ascii="Calibri" w:hAnsi="Calibri"/>
-                <w:b w:val="0"/>
-                <w:sz w:val="20"/>
-              </w:rPr>
               <w:t>docs/Frontend_Hostinger_Google_SignIn_Handoff.docx</w:t>
             </w:r>
           </w:p>
@@ -2733,7 +3151,7 @@
                 <w:b w:val="0"/>
                 <w:sz w:val="20"/>
               </w:rPr>
-              <w:t>This Word document for FE sharing</w:t>
+              <w:t>This Word document</w:t>
             </w:r>
           </w:p>
         </w:tc>

</xml_diff>

<commit_message>
Remove Urdu from FE Hostinger Word handoff.
Co-authored-by: Cursor <cursoragent@cursor.com>
</commit_message>
<xml_diff>
--- a/docs/Frontend_Hostinger_Google_SignIn_Handoff.docx
+++ b/docs/Frontend_Hostinger_Google_SignIn_Handoff.docx
@@ -60,40 +60,6 @@
           <w:sz w:val="22"/>
         </w:rPr>
         <w:t>Auth backend is working. Live Hostinger frontend is not using the required Google flow and Hostinger still 404s SPA routes. Client secrets will not fix this.</w:t>
-      </w:r>
-    </w:p>
-    <w:p>
-      <w:pPr>
-        <w:pStyle w:val="Heading1"/>
-      </w:pPr>
-      <w:r>
-        <w:t>Urdu summary (internal)</w:t>
-      </w:r>
-    </w:p>
-    <w:p>
-      <w:pPr>
-        <w:spacing w:after="120"/>
-      </w:pPr>
-      <w:r>
-        <w:rPr>
-          <w:rFonts w:ascii="Calibri" w:hAnsi="Calibri"/>
-          <w:b w:val="0"/>
-          <w:sz w:val="22"/>
-        </w:rPr>
-        <w:t>Google sign-up Hostinger par is liye nahi chal raha ke live site abhi bhi Google popup (GIS) use karti hai, aur Hostinger par /login, /signup 404 dete hain. Naye client secret se yeh fix nahi hota. FE ko do files public_html mein upload karni hain (.htaccess + google-auth.html) aur Google button ko /google/start redirect par lagana hai. Client secret sirf backend (Vercel) par hota hai — FE ko secret nahi dena.</w:t>
-      </w:r>
-    </w:p>
-    <w:p>
-      <w:pPr>
-        <w:spacing w:after="120"/>
-      </w:pPr>
-      <w:r>
-        <w:rPr>
-          <w:rFonts w:ascii="Calibri" w:hAnsi="Calibri"/>
-          <w:b w:val="0"/>
-          <w:sz w:val="22"/>
-        </w:rPr>
-        <w:t>Doosra issue: admin jab lawyer reject kare to FE ko Pending nahi Rejected dikhana hai, aur dubara apply enable karna hai (canReapply / canApplyAsLawyer).</w:t>
       </w:r>
     </w:p>
     <w:p>

</xml_diff>